<commit_message>
fix(ethical-hacking): set document author, remove group field, update CLAUDE.md
- Set creator/lastModifiedBy to "Dmytro Bilozor" in Lab2 and PW2 reports
- Remove Група field from cover pages (IITU academic mobility subject)
- Add document author rule and no-auto-commit rule to CLAUDE.md

Co-Authored-By: Claude Sonnet 4.6 <noreply@anthropic.com>
</commit_message>
<xml_diff>
--- a/Year 1/Етичний хакінг/Lab_works/Lab_report_2.docx
+++ b/Year 1/Етичний хакінг/Lab_works/Lab_report_2.docx
@@ -372,74 +372,6 @@
                 <w:szCs w:val="22"/>
               </w:rPr>
               <w:t xml:space="preserve">41639</w:t>
-            </w:r>
-          </w:p>
-        </w:tc>
-      </w:tr>
-      <w:tr>
-        <w:tc>
-          <w:tcPr>
-            <w:tcW w:type="dxa" w:w="1900"/>
-            <w:tcBorders>
-              <w:top w:val="single" w:color="2E75B6" w:sz="1"/>
-              <w:left w:val="single" w:color="2E75B6" w:sz="1"/>
-              <w:bottom w:val="single" w:color="2E75B6" w:sz="1"/>
-              <w:right w:val="single" w:color="2E75B6" w:sz="1"/>
-            </w:tcBorders>
-            <w:shd w:fill="D5E8F0" w:val="clear"/>
-            <w:tcMar>
-              <w:top w:type="dxa" w:w="80"/>
-              <w:left w:type="dxa" w:w="120"/>
-              <w:bottom w:type="dxa" w:w="80"/>
-              <w:right w:type="dxa" w:w="120"/>
-            </w:tcMar>
-          </w:tcPr>
-          <w:p>
-            <w:pPr>
-              <w:spacing w:after="0" w:before="0"/>
-            </w:pPr>
-            <w:r>
-              <w:rPr>
-                <w:rFonts w:ascii="Arial" w:cs="Arial" w:eastAsia="Arial" w:hAnsi="Arial"/>
-                <w:b/>
-                <w:bCs/>
-                <w:color w:val="1F3864"/>
-                <w:sz w:val="22"/>
-                <w:szCs w:val="22"/>
-              </w:rPr>
-              <w:t xml:space="preserve">Група:</w:t>
-            </w:r>
-          </w:p>
-        </w:tc>
-        <w:tc>
-          <w:tcPr>
-            <w:tcW w:type="dxa" w:w="4100"/>
-            <w:tcBorders>
-              <w:top w:val="single" w:color="2E75B6" w:sz="1"/>
-              <w:left w:val="single" w:color="2E75B6" w:sz="1"/>
-              <w:bottom w:val="single" w:color="2E75B6" w:sz="1"/>
-              <w:right w:val="single" w:color="2E75B6" w:sz="1"/>
-            </w:tcBorders>
-            <w:shd w:fill="FFFFFF" w:val="clear"/>
-            <w:tcMar>
-              <w:top w:type="dxa" w:w="80"/>
-              <w:left w:type="dxa" w:w="120"/>
-              <w:bottom w:type="dxa" w:w="80"/>
-              <w:right w:type="dxa" w:w="120"/>
-            </w:tcMar>
-          </w:tcPr>
-          <w:p>
-            <w:pPr>
-              <w:spacing w:after="0" w:before="0"/>
-            </w:pPr>
-            <w:r>
-              <w:rPr>
-                <w:rFonts w:ascii="Arial" w:cs="Arial" w:eastAsia="Arial" w:hAnsi="Arial"/>
-                <w:color w:val="1A1A1A"/>
-                <w:sz w:val="22"/>
-                <w:szCs w:val="22"/>
-              </w:rPr>
-              <w:t xml:space="preserve">A-F5-25</w:t>
             </w:r>
           </w:p>
         </w:tc>

</xml_diff>